<commit_message>
Update final report and verification evidence
</commit_message>
<xml_diff>
--- a/docs/CYPHER_Final_Report_Technical_Clarifications.docx
+++ b/docs/CYPHER_Final_Report_Technical_Clarifications.docx
@@ -371,7 +371,7 @@
           <w:color w:val="202A33"/>
           <w:sz w:val="21"/>
         </w:rPr>
-        <w:t>The recommended position is to claim only what is evidenced. CYPHER has a working application, a real six-class detector, a tested incident pipeline and an AWS deployment with a MySQL RDS database. It does not currently have Jenkins, GitHub Actions, Prometheus or Grafana integration.</w:t>
+        <w:t>The recommended position remains to claim only what is evidenced. CYPHER now has a working application, a real six-class detector, a tested incident pipeline, an AWS deployment with a MySQL RDS database, an executable GitHub Actions workflow, a Jenkins pipeline, live Prometheus metrics and a provisioned Grafana dashboard. S3 application routes and private-object handling are implemented and passed a signed upload/download/delete round-trip against an independent S3 server; the AWS IAM boundary is recorded in Section 8.</w:t>
       </w:r>
     </w:p>
     <w:p>
@@ -580,7 +580,7 @@
                 <w:color w:val="202A33"/>
                 <w:sz w:val="16"/>
               </w:rPr>
-              <w:t>Mac runtime: PostgreSQL 16.15. Docker Compose: PostgreSQL 17. AWS DA2: MySQL 8.4.9 on RDS.</w:t>
+              <w:t>Mac runtime: PostgreSQL 16.15. Docker Compose: PostgreSQL 16. AWS DA2: MySQL 8.4.9 on RDS.</w:t>
             </w:r>
           </w:p>
         </w:tc>
@@ -666,7 +666,7 @@
                 <w:color w:val="202A33"/>
                 <w:sz w:val="16"/>
               </w:rPr>
-              <w:t>Jenkins, GitHub Actions, Prometheus and Grafana are not built. S3 is used only for DA2 database backups.</w:t>
+              <w:t>GitHub Actions and Jenkins both completed successful builds. Prometheus and Grafana are live. S3 evidence storage passed an end-to-end upload, signed download, metadata and delete test.</w:t>
             </w:r>
           </w:p>
         </w:tc>
@@ -752,7 +752,7 @@
                 <w:color w:val="202A33"/>
                 <w:sz w:val="16"/>
               </w:rPr>
-              <w:t>Yes. Local development is PostgreSQL; MySQL is confined to the AWS DA2 RDS deployment.</w:t>
+              <w:t>Yes. Local development and Compose use PostgreSQL 16; MySQL is confined to the AWS DA2 RDS deployment.</w:t>
             </w:r>
           </w:p>
         </w:tc>
@@ -838,7 +838,7 @@
                 <w:color w:val="202A33"/>
                 <w:sz w:val="16"/>
               </w:rPr>
-              <w:t>SUPER_ADMIN and ADMIN can open audit and the user directory. SECURITY_MANAGER has a seeded audit permission but is currently denied by the API.</w:t>
+              <w:t>SUPER_ADMIN, ADMIN and SECURITY_MANAGER can read audit. User-directory reads are limited to SUPER_ADMIN and ADMIN; user management remains read-only.</w:t>
             </w:r>
           </w:p>
         </w:tc>
@@ -924,7 +924,7 @@
                 <w:color w:val="202A33"/>
                 <w:sz w:val="16"/>
               </w:rPr>
-              <w:t>Use /auth/login and /api/incidents/ingest. Workflow actions use explicit acknowledge, resolve and delete routes.</w:t>
+              <w:t>Use /auth/login and /api/incidents/ingest. Workflow, export, trace, audit and media routes are listed in Section 4.</w:t>
             </w:r>
           </w:p>
         </w:tc>
@@ -1139,7 +1139,7 @@
           <w:color w:val="202A33"/>
           <w:sz w:val="21"/>
         </w:rPr>
-        <w:t>The version conflict is caused by measuring different environments. The actively running local database is not the same PostgreSQL version pinned by Docker Compose.</w:t>
+        <w:t>The earlier version conflict came from comparing the running local database with an older Compose pin. The repository now standardizes both development paths on PostgreSQL 16.</w:t>
       </w:r>
     </w:p>
     <w:tbl>
@@ -1474,7 +1474,7 @@
                 <w:color w:val="202A33"/>
                 <w:sz w:val="18"/>
               </w:rPr>
-              <w:t>17</w:t>
+              <w:t>16</w:t>
             </w:r>
           </w:p>
         </w:tc>
@@ -1501,7 +1501,7 @@
                 <w:color w:val="202A33"/>
                 <w:sz w:val="18"/>
               </w:rPr>
-              <w:t>docker-compose.yml pins postgres:17 and publishes container port 5432 as host port 5433.</w:t>
+              <w:t>docker-compose.yml pins postgres:16 and publishes container port 5432 as host port 5433.</w:t>
             </w:r>
           </w:p>
         </w:tc>
@@ -1636,7 +1636,7 @@
           <w:color w:val="202A33"/>
           <w:sz w:val="21"/>
         </w:rPr>
-        <w:t>Recommended report wording: “The local application runs on PostgreSQL 16.15; the Docker configuration targets PostgreSQL 17; the AWS DA2 deployment was migrated to Amazon RDS for MySQL 8.4.9.”</w:t>
+        <w:t>Recommended report wording: “The local application and Docker configuration use PostgreSQL 16; the AWS DA2 deployment uses Amazon RDS for MySQL 8.4.9.”</w:t>
       </w:r>
     </w:p>
     <w:p>
@@ -1680,7 +1680,7 @@
           <w:color w:val="202A33"/>
           <w:sz w:val="21"/>
         </w:rPr>
-        <w:t>Review 1 included several tools that are not part of the implemented repository. The table below is the safe final-report position.</w:t>
+        <w:t>The missing delivery and observability items have now been implemented. The evidence column identifies what can be demonstrated and what must be described with a precise boundary.</w:t>
       </w:r>
     </w:p>
     <w:tbl>
@@ -1875,7 +1875,7 @@
                 <w:color w:val="202A33"/>
                 <w:sz w:val="18"/>
               </w:rPr>
-              <w:t>Not built</w:t>
+              <w:t>Implemented and passed</w:t>
             </w:r>
           </w:p>
         </w:tc>
@@ -1902,7 +1902,7 @@
                 <w:color w:val="202A33"/>
                 <w:sz w:val="18"/>
               </w:rPr>
-              <w:t>No Jenkinsfile, pipeline job or Jenkins configuration exists.</w:t>
+              <w:t>Jenkinsfile runs backend verification, reporting build and repository checks; an optional pinned controller image provisions the cypher-ci job.</w:t>
             </w:r>
           </w:p>
         </w:tc>
@@ -1929,7 +1929,7 @@
                 <w:color w:val="202A33"/>
                 <w:sz w:val="18"/>
               </w:rPr>
-              <w:t>Do not list as implemented.</w:t>
+              <w:t>Build #2 passed all stages on 28 October 2026.</w:t>
             </w:r>
           </w:p>
         </w:tc>
@@ -1988,7 +1988,7 @@
                 <w:color w:val="202A33"/>
                 <w:sz w:val="18"/>
               </w:rPr>
-              <w:t>Not built</w:t>
+              <w:t>Implemented and passed</w:t>
             </w:r>
           </w:p>
         </w:tc>
@@ -2015,7 +2015,7 @@
                 <w:color w:val="202A33"/>
                 <w:sz w:val="18"/>
               </w:rPr>
-              <w:t>No .github/workflows directory or CI workflow exists.</w:t>
+              <w:t>.github/workflows/ci.yml runs Java 21 with PostgreSQL 16, .NET 10, frontend/Python/configuration checks and image builds.</w:t>
             </w:r>
           </w:p>
         </w:tc>
@@ -2042,7 +2042,7 @@
                 <w:color w:val="202A33"/>
                 <w:sz w:val="18"/>
               </w:rPr>
-              <w:t>Do not claim automated testing/deployment.</w:t>
+              <w:t>Show the successful workflow run for commit 6b34fed.</w:t>
             </w:r>
           </w:p>
         </w:tc>
@@ -2101,7 +2101,7 @@
                 <w:color w:val="202A33"/>
                 <w:sz w:val="18"/>
               </w:rPr>
-              <w:t>Not built</w:t>
+              <w:t>Implemented and live</w:t>
             </w:r>
           </w:p>
         </w:tc>
@@ -2128,7 +2128,7 @@
                 <w:color w:val="202A33"/>
                 <w:sz w:val="18"/>
               </w:rPr>
-              <w:t>No scrape configuration, exporter or metrics endpoint is configured.</w:t>
+              <w:t>Spring Boot exposes /actuator/prometheus; Prometheus scrapes it every five seconds in Compose and on EC2.</w:t>
             </w:r>
           </w:p>
         </w:tc>
@@ -2155,7 +2155,7 @@
                 <w:color w:val="202A33"/>
                 <w:sz w:val="18"/>
               </w:rPr>
-              <w:t>Do not claim production monitoring.</w:t>
+              <w:t>The live scrape reported cypher_incidents_open and an UP target.</w:t>
             </w:r>
           </w:p>
         </w:tc>
@@ -2214,7 +2214,7 @@
                 <w:color w:val="202A33"/>
                 <w:sz w:val="18"/>
               </w:rPr>
-              <w:t>Not built</w:t>
+              <w:t>Implemented and live</w:t>
             </w:r>
           </w:p>
         </w:tc>
@@ -2241,7 +2241,7 @@
                 <w:color w:val="202A33"/>
                 <w:sz w:val="18"/>
               </w:rPr>
-              <w:t>No dashboards, data sources or provisioning files exist.</w:t>
+              <w:t>Provisioned Prometheus datasource and CYPHER Operations Overview dashboard cover incidents, errors, JVM, actions and latency.</w:t>
             </w:r>
           </w:p>
         </w:tc>
@@ -2268,7 +2268,7 @@
                 <w:color w:val="202A33"/>
                 <w:sz w:val="18"/>
               </w:rPr>
-              <w:t>Do not claim dashboards or alerting.</w:t>
+              <w:t>The dashboard was rendered on AWS and displayed live metric values.</w:t>
             </w:r>
           </w:p>
         </w:tc>
@@ -2327,7 +2327,7 @@
                 <w:color w:val="202A33"/>
                 <w:sz w:val="18"/>
               </w:rPr>
-              <w:t>Partially built for DA2 operations</w:t>
+              <w:t>Implemented and round-trip tested</w:t>
             </w:r>
           </w:p>
         </w:tc>
@@ -2354,7 +2354,7 @@
                 <w:color w:val="202A33"/>
                 <w:sz w:val="18"/>
               </w:rPr>
-              <w:t>DA2 backup process uploads compressed, checksummed MySQL dumps to a private, versioned and encrypted S3 bucket.</w:t>
+              <w:t>Private media API accepts JPEG/PNG/WebP/MP4 up to 25 MB, stores metadata, returns ten-minute signed links and deletes objects through the EC2 role.</w:t>
             </w:r>
           </w:p>
         </w:tc>
@@ -2381,7 +2381,7 @@
                 <w:color w:val="202A33"/>
                 <w:sz w:val="18"/>
               </w:rPr>
-              <w:t>Describe it as cloud backup evidence, not in-app media storage.</w:t>
+              <w:t>A SHA-256-verified S3 protocol round-trip passed. The remaining AWS IAM provisioning boundary is stated in Section 8.</w:t>
             </w:r>
           </w:p>
         </w:tc>
@@ -2403,7 +2403,7 @@
           <w:color w:val="202A33"/>
           <w:sz w:val="21"/>
         </w:rPr>
-        <w:t>The architecture drawing also labels Jenkins, GitHub Actions and Prometheus/Grafana as deferred. That matches the repository state. The S3 bucket is real DA2 work, but the application itself still does not implement a general S3 media or archive service.</w:t>
+        <w:t>The CI/CD and monitoring stack is a repeatable project capability, not a sketch. The application uses AWS S3 without static access keys; local development can use the optional LocalStack profile when an internet connection is unavailable.</w:t>
       </w:r>
     </w:p>
     <w:p>
@@ -2682,7 +2682,7 @@
                 <w:color w:val="202A33"/>
                 <w:sz w:val="18"/>
               </w:rPr>
-              <w:t>Acknowledge, resolve, delete, ingest, configure assets, export</w:t>
+              <w:t>Acknowledge, resolve, delete, ingest, configure assets, manage evidence and export</w:t>
             </w:r>
           </w:p>
         </w:tc>
@@ -2795,7 +2795,7 @@
                 <w:color w:val="202A33"/>
                 <w:sz w:val="18"/>
               </w:rPr>
-              <w:t>Acknowledge, resolve, delete, ingest, configure assets, export</w:t>
+              <w:t>Acknowledge, resolve, delete, ingest, configure assets, manage evidence and export</w:t>
             </w:r>
           </w:p>
         </w:tc>
@@ -2854,7 +2854,7 @@
                 <w:color w:val="202A33"/>
                 <w:sz w:val="18"/>
               </w:rPr>
-              <w:t>No in current API</w:t>
+              <w:t>Yes</w:t>
             </w:r>
           </w:p>
         </w:tc>
@@ -2908,7 +2908,7 @@
                 <w:color w:val="202A33"/>
                 <w:sz w:val="18"/>
               </w:rPr>
-              <w:t>Acknowledge, resolve, ingest, configure cameras; seeded AUDIT_READ is not honoured by current API matcher</w:t>
+              <w:t>Acknowledge, resolve, ingest, configure cameras/projects, manage evidence and export</w:t>
             </w:r>
           </w:p>
         </w:tc>
@@ -3134,7 +3134,7 @@
                 <w:color w:val="202A33"/>
                 <w:sz w:val="18"/>
               </w:rPr>
-              <w:t>Acknowledge and resolve incidents; export reports</w:t>
+              <w:t>Acknowledge and resolve incidents, manage evidence and export reports</w:t>
             </w:r>
           </w:p>
         </w:tc>
@@ -3247,7 +3247,7 @@
                 <w:color w:val="202A33"/>
                 <w:sz w:val="18"/>
               </w:rPr>
-              <w:t>Read-only; cannot acknowledge, resolve, delete or export</w:t>
+              <w:t>Read-only; cannot acknowledge, resolve, delete, upload evidence or export</w:t>
             </w:r>
           </w:p>
         </w:tc>
@@ -3283,7 +3283,7 @@
           <w:color w:val="202A33"/>
           <w:sz w:val="21"/>
         </w:rPr>
-        <w:t>Access-control inconsistency to fix or disclose: the seeded SECURITY_MANAGER role has AUDIT_READ, but SecurityConfig currently permits /api/audit/** only for SUPER_ADMIN and ADMIN. The effective API behaviour is therefore the narrower rule.</w:t>
+        <w:t>The earlier SECURITY_MANAGER audit mismatch has been corrected. The API now permits /api/audit/** for SUPER_ADMIN, ADMIN and SECURITY_MANAGER, matching the seeded AUDIT_READ permission. Integration tests verify both the allowed SECURITY_MANAGER case and the denied VIEWER case.</w:t>
       </w:r>
     </w:p>
     <w:p>
@@ -4916,7 +4916,7 @@
                 <w:color w:val="202A33"/>
                 <w:sz w:val="17"/>
               </w:rPr>
-              <w:t>/api/trace</w:t>
+              <w:t>/api/incidents/{id}/media</w:t>
             </w:r>
           </w:p>
         </w:tc>
@@ -4970,7 +4970,7 @@
                 <w:color w:val="202A33"/>
                 <w:sz w:val="17"/>
               </w:rPr>
-              <w:t>Stream detector reasoning to Live trace</w:t>
+              <w:t>Upload private evidence; operational roles</w:t>
             </w:r>
           </w:p>
         </w:tc>
@@ -5029,7 +5029,7 @@
                 <w:color w:val="202A33"/>
                 <w:sz w:val="17"/>
               </w:rPr>
-              <w:t>/api/reports/incidents.csv</w:t>
+              <w:t>/api/incidents/{id}/media</w:t>
             </w:r>
           </w:p>
         </w:tc>
@@ -5083,7 +5083,233 @@
                 <w:color w:val="202A33"/>
                 <w:sz w:val="17"/>
               </w:rPr>
-              <w:t>CSV export</w:t>
+              <w:t>List evidence with temporary signed links</w:t>
+            </w:r>
+          </w:p>
+        </w:tc>
+      </w:tr>
+      <w:tr>
+        <w:trPr>
+          <w:cantSplit/>
+        </w:trPr>
+        <w:tc>
+          <w:tcPr>
+            <w:tcW w:type="dxa" w:w="1134"/>
+            <w:shd w:fill="FFFFFF"/>
+            <w:tcMar>
+              <w:top w:w="58" w:type="dxa"/>
+              <w:start w:w="120" w:type="dxa"/>
+              <w:bottom w:w="58" w:type="dxa"/>
+              <w:end w:w="120" w:type="dxa"/>
+            </w:tcMar>
+            <w:vAlign w:val="center"/>
+          </w:tcPr>
+          <w:p>
+            <w:pPr>
+              <w:spacing w:after="0" w:line="252" w:lineRule="auto"/>
+            </w:pPr>
+            <w:r>
+              <w:rPr>
+                <w:rFonts w:ascii="Arial" w:hAnsi="Arial"/>
+                <w:b w:val="0"/>
+                <w:color w:val="202A33"/>
+                <w:sz w:val="17"/>
+              </w:rPr>
+              <w:t>DELETE</w:t>
+            </w:r>
+          </w:p>
+        </w:tc>
+        <w:tc>
+          <w:tcPr>
+            <w:tcW w:type="dxa" w:w="3742"/>
+            <w:shd w:fill="FFFFFF"/>
+            <w:tcMar>
+              <w:top w:w="58" w:type="dxa"/>
+              <w:start w:w="120" w:type="dxa"/>
+              <w:bottom w:w="58" w:type="dxa"/>
+              <w:end w:w="120" w:type="dxa"/>
+            </w:tcMar>
+            <w:vAlign w:val="center"/>
+          </w:tcPr>
+          <w:p>
+            <w:pPr>
+              <w:spacing w:after="0" w:line="252" w:lineRule="auto"/>
+            </w:pPr>
+            <w:r>
+              <w:rPr>
+                <w:rFonts w:ascii="Arial" w:hAnsi="Arial"/>
+                <w:b w:val="0"/>
+                <w:color w:val="202A33"/>
+                <w:sz w:val="17"/>
+              </w:rPr>
+              <w:t>/api/incidents/{id}/media/{mediaId}</w:t>
+            </w:r>
+          </w:p>
+        </w:tc>
+        <w:tc>
+          <w:tcPr>
+            <w:tcW w:type="dxa" w:w="1871"/>
+            <w:shd w:fill="FFFFFF"/>
+            <w:tcMar>
+              <w:top w:w="58" w:type="dxa"/>
+              <w:start w:w="120" w:type="dxa"/>
+              <w:bottom w:w="58" w:type="dxa"/>
+              <w:end w:w="120" w:type="dxa"/>
+            </w:tcMar>
+            <w:vAlign w:val="center"/>
+          </w:tcPr>
+          <w:p>
+            <w:pPr>
+              <w:spacing w:after="0" w:line="252" w:lineRule="auto"/>
+            </w:pPr>
+            <w:r>
+              <w:rPr>
+                <w:rFonts w:ascii="Arial" w:hAnsi="Arial"/>
+                <w:b w:val="0"/>
+                <w:color w:val="202A33"/>
+                <w:sz w:val="17"/>
+              </w:rPr>
+              <w:t>Bearer JWT</w:t>
+            </w:r>
+          </w:p>
+        </w:tc>
+        <w:tc>
+          <w:tcPr>
+            <w:tcW w:type="dxa" w:w="3742"/>
+            <w:shd w:fill="FFFFFF"/>
+            <w:tcMar>
+              <w:top w:w="58" w:type="dxa"/>
+              <w:start w:w="120" w:type="dxa"/>
+              <w:bottom w:w="58" w:type="dxa"/>
+              <w:end w:w="120" w:type="dxa"/>
+            </w:tcMar>
+            <w:vAlign w:val="center"/>
+          </w:tcPr>
+          <w:p>
+            <w:pPr>
+              <w:spacing w:after="0" w:line="252" w:lineRule="auto"/>
+            </w:pPr>
+            <w:r>
+              <w:rPr>
+                <w:rFonts w:ascii="Arial" w:hAnsi="Arial"/>
+                <w:b w:val="0"/>
+                <w:color w:val="202A33"/>
+                <w:sz w:val="17"/>
+              </w:rPr>
+              <w:t>Delete private evidence; operational roles</w:t>
+            </w:r>
+          </w:p>
+        </w:tc>
+      </w:tr>
+      <w:tr>
+        <w:trPr>
+          <w:cantSplit/>
+        </w:trPr>
+        <w:tc>
+          <w:tcPr>
+            <w:tcW w:type="dxa" w:w="1134"/>
+            <w:shd w:fill="F4F8FA"/>
+            <w:tcMar>
+              <w:top w:w="58" w:type="dxa"/>
+              <w:start w:w="120" w:type="dxa"/>
+              <w:bottom w:w="58" w:type="dxa"/>
+              <w:end w:w="120" w:type="dxa"/>
+            </w:tcMar>
+            <w:vAlign w:val="center"/>
+          </w:tcPr>
+          <w:p>
+            <w:pPr>
+              <w:spacing w:after="0" w:line="252" w:lineRule="auto"/>
+            </w:pPr>
+            <w:r>
+              <w:rPr>
+                <w:rFonts w:ascii="Arial" w:hAnsi="Arial"/>
+                <w:b w:val="0"/>
+                <w:color w:val="202A33"/>
+                <w:sz w:val="17"/>
+              </w:rPr>
+              <w:t>POST</w:t>
+            </w:r>
+          </w:p>
+        </w:tc>
+        <w:tc>
+          <w:tcPr>
+            <w:tcW w:type="dxa" w:w="3742"/>
+            <w:shd w:fill="F4F8FA"/>
+            <w:tcMar>
+              <w:top w:w="58" w:type="dxa"/>
+              <w:start w:w="120" w:type="dxa"/>
+              <w:bottom w:w="58" w:type="dxa"/>
+              <w:end w:w="120" w:type="dxa"/>
+            </w:tcMar>
+            <w:vAlign w:val="center"/>
+          </w:tcPr>
+          <w:p>
+            <w:pPr>
+              <w:spacing w:after="0" w:line="252" w:lineRule="auto"/>
+            </w:pPr>
+            <w:r>
+              <w:rPr>
+                <w:rFonts w:ascii="Arial" w:hAnsi="Arial"/>
+                <w:b w:val="0"/>
+                <w:color w:val="202A33"/>
+                <w:sz w:val="17"/>
+              </w:rPr>
+              <w:t>/api/trace</w:t>
+            </w:r>
+          </w:p>
+        </w:tc>
+        <w:tc>
+          <w:tcPr>
+            <w:tcW w:type="dxa" w:w="1871"/>
+            <w:shd w:fill="F4F8FA"/>
+            <w:tcMar>
+              <w:top w:w="58" w:type="dxa"/>
+              <w:start w:w="120" w:type="dxa"/>
+              <w:bottom w:w="58" w:type="dxa"/>
+              <w:end w:w="120" w:type="dxa"/>
+            </w:tcMar>
+            <w:vAlign w:val="center"/>
+          </w:tcPr>
+          <w:p>
+            <w:pPr>
+              <w:spacing w:after="0" w:line="252" w:lineRule="auto"/>
+            </w:pPr>
+            <w:r>
+              <w:rPr>
+                <w:rFonts w:ascii="Arial" w:hAnsi="Arial"/>
+                <w:b w:val="0"/>
+                <w:color w:val="202A33"/>
+                <w:sz w:val="17"/>
+              </w:rPr>
+              <w:t>Bearer JWT</w:t>
+            </w:r>
+          </w:p>
+        </w:tc>
+        <w:tc>
+          <w:tcPr>
+            <w:tcW w:type="dxa" w:w="3742"/>
+            <w:shd w:fill="F4F8FA"/>
+            <w:tcMar>
+              <w:top w:w="58" w:type="dxa"/>
+              <w:start w:w="120" w:type="dxa"/>
+              <w:bottom w:w="58" w:type="dxa"/>
+              <w:end w:w="120" w:type="dxa"/>
+            </w:tcMar>
+            <w:vAlign w:val="center"/>
+          </w:tcPr>
+          <w:p>
+            <w:pPr>
+              <w:spacing w:after="0" w:line="252" w:lineRule="auto"/>
+            </w:pPr>
+            <w:r>
+              <w:rPr>
+                <w:rFonts w:ascii="Arial" w:hAnsi="Arial"/>
+                <w:b w:val="0"/>
+                <w:color w:val="202A33"/>
+                <w:sz w:val="17"/>
+              </w:rPr>
+              <w:t>Stream detector reasoning to Live trace</w:t>
             </w:r>
           </w:p>
         </w:tc>
@@ -5142,7 +5368,7 @@
                 <w:color w:val="202A33"/>
                 <w:sz w:val="17"/>
               </w:rPr>
-              <w:t>/api/reports/incidents.xlsx</w:t>
+              <w:t>/api/reports/incidents.csv</w:t>
             </w:r>
           </w:p>
         </w:tc>
@@ -5196,7 +5422,7 @@
                 <w:color w:val="202A33"/>
                 <w:sz w:val="17"/>
               </w:rPr>
-              <w:t>Excel export</w:t>
+              <w:t>CSV export</w:t>
             </w:r>
           </w:p>
         </w:tc>
@@ -5255,7 +5481,7 @@
                 <w:color w:val="202A33"/>
                 <w:sz w:val="17"/>
               </w:rPr>
-              <w:t>/api/reports/incidents.pdf</w:t>
+              <w:t>/api/reports/incidents.xlsx</w:t>
             </w:r>
           </w:p>
         </w:tc>
@@ -5309,7 +5535,7 @@
                 <w:color w:val="202A33"/>
                 <w:sz w:val="17"/>
               </w:rPr>
-              <w:t>PDF export</w:t>
+              <w:t>Excel export</w:t>
             </w:r>
           </w:p>
         </w:tc>
@@ -5368,7 +5594,7 @@
                 <w:color w:val="202A33"/>
                 <w:sz w:val="17"/>
               </w:rPr>
-              <w:t>/api/audit?limit=100</w:t>
+              <w:t>/api/reports/incidents.pdf</w:t>
             </w:r>
           </w:p>
         </w:tc>
@@ -5422,7 +5648,7 @@
                 <w:color w:val="202A33"/>
                 <w:sz w:val="17"/>
               </w:rPr>
-              <w:t>Audit trail; SUPER_ADMIN/ADMIN only</w:t>
+              <w:t>PDF export</w:t>
             </w:r>
           </w:p>
         </w:tc>
@@ -5481,7 +5707,7 @@
                 <w:color w:val="202A33"/>
                 <w:sz w:val="17"/>
               </w:rPr>
-              <w:t>/users and /users/email/{email}</w:t>
+              <w:t>/api/audit?limit=100</w:t>
             </w:r>
           </w:p>
         </w:tc>
@@ -5516,6 +5742,119 @@
           <w:tcPr>
             <w:tcW w:type="dxa" w:w="3742"/>
             <w:shd w:fill="F4F8FA"/>
+            <w:tcMar>
+              <w:top w:w="58" w:type="dxa"/>
+              <w:start w:w="120" w:type="dxa"/>
+              <w:bottom w:w="58" w:type="dxa"/>
+              <w:end w:w="120" w:type="dxa"/>
+            </w:tcMar>
+            <w:vAlign w:val="center"/>
+          </w:tcPr>
+          <w:p>
+            <w:pPr>
+              <w:spacing w:after="0" w:line="252" w:lineRule="auto"/>
+            </w:pPr>
+            <w:r>
+              <w:rPr>
+                <w:rFonts w:ascii="Arial" w:hAnsi="Arial"/>
+                <w:b w:val="0"/>
+                <w:color w:val="202A33"/>
+                <w:sz w:val="17"/>
+              </w:rPr>
+              <w:t>Audit trail; SUPER_ADMIN/ADMIN/SECURITY_MANAGER</w:t>
+            </w:r>
+          </w:p>
+        </w:tc>
+      </w:tr>
+      <w:tr>
+        <w:trPr>
+          <w:cantSplit/>
+        </w:trPr>
+        <w:tc>
+          <w:tcPr>
+            <w:tcW w:type="dxa" w:w="1134"/>
+            <w:shd w:fill="FFFFFF"/>
+            <w:tcMar>
+              <w:top w:w="58" w:type="dxa"/>
+              <w:start w:w="120" w:type="dxa"/>
+              <w:bottom w:w="58" w:type="dxa"/>
+              <w:end w:w="120" w:type="dxa"/>
+            </w:tcMar>
+            <w:vAlign w:val="center"/>
+          </w:tcPr>
+          <w:p>
+            <w:pPr>
+              <w:spacing w:after="0" w:line="252" w:lineRule="auto"/>
+            </w:pPr>
+            <w:r>
+              <w:rPr>
+                <w:rFonts w:ascii="Arial" w:hAnsi="Arial"/>
+                <w:b w:val="0"/>
+                <w:color w:val="202A33"/>
+                <w:sz w:val="17"/>
+              </w:rPr>
+              <w:t>GET</w:t>
+            </w:r>
+          </w:p>
+        </w:tc>
+        <w:tc>
+          <w:tcPr>
+            <w:tcW w:type="dxa" w:w="3742"/>
+            <w:shd w:fill="FFFFFF"/>
+            <w:tcMar>
+              <w:top w:w="58" w:type="dxa"/>
+              <w:start w:w="120" w:type="dxa"/>
+              <w:bottom w:w="58" w:type="dxa"/>
+              <w:end w:w="120" w:type="dxa"/>
+            </w:tcMar>
+            <w:vAlign w:val="center"/>
+          </w:tcPr>
+          <w:p>
+            <w:pPr>
+              <w:spacing w:after="0" w:line="252" w:lineRule="auto"/>
+            </w:pPr>
+            <w:r>
+              <w:rPr>
+                <w:rFonts w:ascii="Arial" w:hAnsi="Arial"/>
+                <w:b w:val="0"/>
+                <w:color w:val="202A33"/>
+                <w:sz w:val="17"/>
+              </w:rPr>
+              <w:t>/users and /users/email/{email}</w:t>
+            </w:r>
+          </w:p>
+        </w:tc>
+        <w:tc>
+          <w:tcPr>
+            <w:tcW w:type="dxa" w:w="1871"/>
+            <w:shd w:fill="FFFFFF"/>
+            <w:tcMar>
+              <w:top w:w="58" w:type="dxa"/>
+              <w:start w:w="120" w:type="dxa"/>
+              <w:bottom w:w="58" w:type="dxa"/>
+              <w:end w:w="120" w:type="dxa"/>
+            </w:tcMar>
+            <w:vAlign w:val="center"/>
+          </w:tcPr>
+          <w:p>
+            <w:pPr>
+              <w:spacing w:after="0" w:line="252" w:lineRule="auto"/>
+            </w:pPr>
+            <w:r>
+              <w:rPr>
+                <w:rFonts w:ascii="Arial" w:hAnsi="Arial"/>
+                <w:b w:val="0"/>
+                <w:color w:val="202A33"/>
+                <w:sz w:val="17"/>
+              </w:rPr>
+              <w:t>Bearer JWT</w:t>
+            </w:r>
+          </w:p>
+        </w:tc>
+        <w:tc>
+          <w:tcPr>
+            <w:tcW w:type="dxa" w:w="3742"/>
+            <w:shd w:fill="FFFFFF"/>
             <w:tcMar>
               <w:top w:w="58" w:type="dxa"/>
               <w:start w:w="120" w:type="dxa"/>
@@ -5607,6 +5946,20 @@
           <w:sz w:val="21"/>
         </w:rPr>
         <w:t>Use wss on HTTPS. The JWT is supplied in the query string because the browser WebSocket API cannot set an Authorization header; the handshake interceptor validates it.</w:t>
+      </w:r>
+    </w:p>
+    <w:p>
+      <w:pPr>
+        <w:spacing w:after="120" w:before="0" w:line="269" w:lineRule="auto"/>
+      </w:pPr>
+      <w:r>
+        <w:rPr>
+          <w:rFonts w:ascii="Arial" w:hAnsi="Arial"/>
+          <w:b w:val="0"/>
+          <w:color w:val="202A33"/>
+          <w:sz w:val="21"/>
+        </w:rPr>
+        <w:t>Public operational probes are GET /health, GET /actuator/health and GET /actuator/prometheus. The last endpoint is the Prometheus scrape surface; it contains operational metadata rather than incident evidence and is restricted to the deployment/application network in a hardened setup.</w:t>
       </w:r>
     </w:p>
     <w:p>
@@ -8620,7 +8973,7 @@
                 <w:color w:val="202A33"/>
                 <w:sz w:val="18"/>
               </w:rPr>
-              <w:t>Say: local PostgreSQL 16.15; Docker targets PostgreSQL 17; AWS DA2 uses RDS MySQL 8.4.9.</w:t>
+              <w:t>Say: local and Compose use PostgreSQL 16; AWS DA2 uses RDS MySQL 8.4.9.</w:t>
             </w:r>
           </w:p>
         </w:tc>
@@ -8647,7 +9000,7 @@
                 <w:color w:val="202A33"/>
                 <w:sz w:val="18"/>
               </w:rPr>
-              <w:t>Do not say one database version applies everywhere.</w:t>
+              <w:t>Do not say one database engine applies everywhere.</w:t>
             </w:r>
           </w:p>
         </w:tc>
@@ -8706,7 +9059,7 @@
                 <w:color w:val="202A33"/>
                 <w:sz w:val="18"/>
               </w:rPr>
-              <w:t>Say: EC2 deployment, RDS migration, S3 database backups, EBS snapshots and lifecycle backups are DA2 evidence.</w:t>
+              <w:t>Say: EC2 deployment, RDS, private S3-compatible evidence storage, GitHub Actions, Jenkins pipeline-as-code, Prometheus and Grafana are implemented.</w:t>
             </w:r>
           </w:p>
         </w:tc>
@@ -8733,7 +9086,7 @@
                 <w:color w:val="202A33"/>
                 <w:sz w:val="18"/>
               </w:rPr>
-              <w:t>Do not list Jenkins, GitHub Actions, Prometheus or Grafana as built.</w:t>
+              <w:t>Do not claim the live AWS bucket until the role permission is granted.</w:t>
             </w:r>
           </w:p>
         </w:tc>
@@ -9050,7 +9403,7 @@
                 <w:color w:val="202A33"/>
                 <w:sz w:val="18"/>
               </w:rPr>
-              <w:t>Say the effective API allows audit and user directory to SUPER_ADMIN/ADMIN, with the SECURITY_MANAGER audit mismatch disclosed.</w:t>
+              <w:t>Say SECURITY_MANAGER, ADMIN and SUPER_ADMIN can read audit; only SUPER_ADMIN/ADMIN can read the user directory.</w:t>
             </w:r>
           </w:p>
         </w:tc>
@@ -9077,7 +9430,7 @@
                 <w:color w:val="202A33"/>
                 <w:sz w:val="18"/>
               </w:rPr>
-              <w:t>Do not say SECURITY_MANAGER currently opens audit through the API.</w:t>
+              <w:t>Do not describe user management as full CRUD.</w:t>
             </w:r>
           </w:p>
         </w:tc>
@@ -9101,7 +9454,784 @@
           <w:color w:val="000000"/>
           <w:sz w:val="30"/>
         </w:rPr>
-        <w:t>8. Evidence locations</w:t>
+        <w:t>8. Verification evidence</w:t>
+      </w:r>
+    </w:p>
+    <w:tbl>
+      <w:tblPr>
+        <w:tblW w:type="auto" w:w="0"/>
+        <w:jc w:val="center"/>
+        <w:tblLayout w:type="fixed"/>
+        <w:tblLook w:firstColumn="1" w:firstRow="1" w:lastColumn="0" w:lastRow="0" w:noHBand="0" w:noVBand="1" w:val="04A0"/>
+        <w:tblBorders>
+          <w:top w:val="single" w:sz="5" w:space="0" w:color="D7DCE1"/>
+          <w:left w:val="single" w:sz="5" w:space="0" w:color="D7DCE1"/>
+          <w:bottom w:val="single" w:sz="5" w:space="0" w:color="D7DCE1"/>
+          <w:right w:val="single" w:sz="5" w:space="0" w:color="D7DCE1"/>
+          <w:insideH w:val="single" w:sz="5" w:space="0" w:color="D7DCE1"/>
+          <w:insideV w:val="single" w:sz="5" w:space="0" w:color="D7DCE1"/>
+        </w:tblBorders>
+      </w:tblPr>
+      <w:tblGrid>
+        <w:gridCol w:w="3213"/>
+        <w:gridCol w:w="3213"/>
+        <w:gridCol w:w="3213"/>
+      </w:tblGrid>
+      <w:tr>
+        <w:trPr>
+          <w:tblHeader w:val="true"/>
+        </w:trPr>
+        <w:tc>
+          <w:tcPr>
+            <w:tcW w:type="dxa" w:w="2268"/>
+            <w:shd w:fill="17324D"/>
+            <w:tcMar>
+              <w:top w:w="70" w:type="dxa"/>
+              <w:start w:w="120" w:type="dxa"/>
+              <w:bottom w:w="70" w:type="dxa"/>
+              <w:end w:w="120" w:type="dxa"/>
+            </w:tcMar>
+            <w:vAlign w:val="center"/>
+          </w:tcPr>
+          <w:p>
+            <w:pPr>
+              <w:spacing w:after="0"/>
+              <w:jc w:val="left"/>
+            </w:pPr>
+            <w:r>
+              <w:rPr>
+                <w:rFonts w:ascii="Arial" w:hAnsi="Arial"/>
+                <w:b/>
+                <w:color w:val="FFFFFF"/>
+                <w:sz w:val="19"/>
+              </w:rPr>
+              <w:t>Check</w:t>
+            </w:r>
+          </w:p>
+        </w:tc>
+        <w:tc>
+          <w:tcPr>
+            <w:tcW w:type="dxa" w:w="1701"/>
+            <w:shd w:fill="17324D"/>
+            <w:tcMar>
+              <w:top w:w="70" w:type="dxa"/>
+              <w:start w:w="120" w:type="dxa"/>
+              <w:bottom w:w="70" w:type="dxa"/>
+              <w:end w:w="120" w:type="dxa"/>
+            </w:tcMar>
+            <w:vAlign w:val="center"/>
+          </w:tcPr>
+          <w:p>
+            <w:pPr>
+              <w:spacing w:after="0"/>
+              <w:jc w:val="left"/>
+            </w:pPr>
+            <w:r>
+              <w:rPr>
+                <w:rFonts w:ascii="Arial" w:hAnsi="Arial"/>
+                <w:b/>
+                <w:color w:val="FFFFFF"/>
+                <w:sz w:val="19"/>
+              </w:rPr>
+              <w:t>Result</w:t>
+            </w:r>
+          </w:p>
+        </w:tc>
+        <w:tc>
+          <w:tcPr>
+            <w:tcW w:type="dxa" w:w="6633"/>
+            <w:shd w:fill="17324D"/>
+            <w:tcMar>
+              <w:top w:w="70" w:type="dxa"/>
+              <w:start w:w="120" w:type="dxa"/>
+              <w:bottom w:w="70" w:type="dxa"/>
+              <w:end w:w="120" w:type="dxa"/>
+            </w:tcMar>
+            <w:vAlign w:val="center"/>
+          </w:tcPr>
+          <w:p>
+            <w:pPr>
+              <w:spacing w:after="0"/>
+              <w:jc w:val="left"/>
+            </w:pPr>
+            <w:r>
+              <w:rPr>
+                <w:rFonts w:ascii="Arial" w:hAnsi="Arial"/>
+                <w:b/>
+                <w:color w:val="FFFFFF"/>
+                <w:sz w:val="19"/>
+              </w:rPr>
+              <w:t>Evidence</w:t>
+            </w:r>
+          </w:p>
+        </w:tc>
+      </w:tr>
+      <w:tr>
+        <w:trPr>
+          <w:cantSplit/>
+        </w:trPr>
+        <w:tc>
+          <w:tcPr>
+            <w:tcW w:type="dxa" w:w="2268"/>
+            <w:shd w:fill="FFFFFF"/>
+            <w:tcMar>
+              <w:top w:w="80" w:type="dxa"/>
+              <w:start w:w="120" w:type="dxa"/>
+              <w:bottom w:w="80" w:type="dxa"/>
+              <w:end w:w="120" w:type="dxa"/>
+            </w:tcMar>
+            <w:vAlign w:val="center"/>
+          </w:tcPr>
+          <w:p>
+            <w:pPr>
+              <w:spacing w:after="0" w:line="252" w:lineRule="auto"/>
+            </w:pPr>
+            <w:r>
+              <w:rPr>
+                <w:rFonts w:ascii="Arial" w:hAnsi="Arial"/>
+                <w:b w:val="0"/>
+                <w:color w:val="202A33"/>
+                <w:sz w:val="16"/>
+              </w:rPr>
+              <w:t>PostgreSQL regression suite</w:t>
+            </w:r>
+          </w:p>
+        </w:tc>
+        <w:tc>
+          <w:tcPr>
+            <w:tcW w:type="dxa" w:w="1701"/>
+            <w:shd w:fill="FFFFFF"/>
+            <w:tcMar>
+              <w:top w:w="80" w:type="dxa"/>
+              <w:start w:w="120" w:type="dxa"/>
+              <w:bottom w:w="80" w:type="dxa"/>
+              <w:end w:w="120" w:type="dxa"/>
+            </w:tcMar>
+            <w:vAlign w:val="center"/>
+          </w:tcPr>
+          <w:p>
+            <w:pPr>
+              <w:spacing w:after="0" w:line="252" w:lineRule="auto"/>
+            </w:pPr>
+            <w:r>
+              <w:rPr>
+                <w:rFonts w:ascii="Arial" w:hAnsi="Arial"/>
+                <w:b w:val="0"/>
+                <w:color w:val="202A33"/>
+                <w:sz w:val="16"/>
+              </w:rPr>
+              <w:t>Passed</w:t>
+            </w:r>
+          </w:p>
+        </w:tc>
+        <w:tc>
+          <w:tcPr>
+            <w:tcW w:type="dxa" w:w="6633"/>
+            <w:shd w:fill="FFFFFF"/>
+            <w:tcMar>
+              <w:top w:w="80" w:type="dxa"/>
+              <w:start w:w="120" w:type="dxa"/>
+              <w:bottom w:w="80" w:type="dxa"/>
+              <w:end w:w="120" w:type="dxa"/>
+            </w:tcMar>
+            <w:vAlign w:val="center"/>
+          </w:tcPr>
+          <w:p>
+            <w:pPr>
+              <w:spacing w:after="0" w:line="252" w:lineRule="auto"/>
+            </w:pPr>
+            <w:r>
+              <w:rPr>
+                <w:rFonts w:ascii="Arial" w:hAnsi="Arial"/>
+                <w:b w:val="0"/>
+                <w:color w:val="202A33"/>
+                <w:sz w:val="16"/>
+              </w:rPr>
+              <w:t>Six Spring Boot/JUnit tests, including SECURITY_MANAGER audit permission, VIEWER denial, media authorization and the controlled S3-disabled response.</w:t>
+            </w:r>
+          </w:p>
+        </w:tc>
+      </w:tr>
+      <w:tr>
+        <w:trPr>
+          <w:cantSplit/>
+        </w:trPr>
+        <w:tc>
+          <w:tcPr>
+            <w:tcW w:type="dxa" w:w="2268"/>
+            <w:shd w:fill="F4F8FA"/>
+            <w:tcMar>
+              <w:top w:w="80" w:type="dxa"/>
+              <w:start w:w="120" w:type="dxa"/>
+              <w:bottom w:w="80" w:type="dxa"/>
+              <w:end w:w="120" w:type="dxa"/>
+            </w:tcMar>
+            <w:vAlign w:val="center"/>
+          </w:tcPr>
+          <w:p>
+            <w:pPr>
+              <w:spacing w:after="0" w:line="252" w:lineRule="auto"/>
+            </w:pPr>
+            <w:r>
+              <w:rPr>
+                <w:rFonts w:ascii="Arial" w:hAnsi="Arial"/>
+                <w:b w:val="0"/>
+                <w:color w:val="202A33"/>
+                <w:sz w:val="16"/>
+              </w:rPr>
+              <w:t>GitHub Actions</w:t>
+            </w:r>
+          </w:p>
+        </w:tc>
+        <w:tc>
+          <w:tcPr>
+            <w:tcW w:type="dxa" w:w="1701"/>
+            <w:shd w:fill="F4F8FA"/>
+            <w:tcMar>
+              <w:top w:w="80" w:type="dxa"/>
+              <w:start w:w="120" w:type="dxa"/>
+              <w:bottom w:w="80" w:type="dxa"/>
+              <w:end w:w="120" w:type="dxa"/>
+            </w:tcMar>
+            <w:vAlign w:val="center"/>
+          </w:tcPr>
+          <w:p>
+            <w:pPr>
+              <w:spacing w:after="0" w:line="252" w:lineRule="auto"/>
+            </w:pPr>
+            <w:r>
+              <w:rPr>
+                <w:rFonts w:ascii="Arial" w:hAnsi="Arial"/>
+                <w:b w:val="0"/>
+                <w:color w:val="202A33"/>
+                <w:sz w:val="16"/>
+              </w:rPr>
+              <w:t>Passed</w:t>
+            </w:r>
+          </w:p>
+        </w:tc>
+        <w:tc>
+          <w:tcPr>
+            <w:tcW w:type="dxa" w:w="6633"/>
+            <w:shd w:fill="F4F8FA"/>
+            <w:tcMar>
+              <w:top w:w="80" w:type="dxa"/>
+              <w:start w:w="120" w:type="dxa"/>
+              <w:bottom w:w="80" w:type="dxa"/>
+              <w:end w:w="120" w:type="dxa"/>
+            </w:tcMar>
+            <w:vAlign w:val="center"/>
+          </w:tcPr>
+          <w:p>
+            <w:pPr>
+              <w:spacing w:after="0" w:line="252" w:lineRule="auto"/>
+            </w:pPr>
+            <w:r>
+              <w:rPr>
+                <w:rFonts w:ascii="Arial" w:hAnsi="Arial"/>
+                <w:b w:val="0"/>
+                <w:color w:val="202A33"/>
+                <w:sz w:val="16"/>
+              </w:rPr>
+              <w:t>Run 40651469386 completed successfully for commit 6b34fed: backend, reporting, quality checks and both Docker image builds.</w:t>
+            </w:r>
+          </w:p>
+        </w:tc>
+      </w:tr>
+      <w:tr>
+        <w:trPr>
+          <w:cantSplit/>
+        </w:trPr>
+        <w:tc>
+          <w:tcPr>
+            <w:tcW w:type="dxa" w:w="2268"/>
+            <w:shd w:fill="FFFFFF"/>
+            <w:tcMar>
+              <w:top w:w="80" w:type="dxa"/>
+              <w:start w:w="120" w:type="dxa"/>
+              <w:bottom w:w="80" w:type="dxa"/>
+              <w:end w:w="120" w:type="dxa"/>
+            </w:tcMar>
+            <w:vAlign w:val="center"/>
+          </w:tcPr>
+          <w:p>
+            <w:pPr>
+              <w:spacing w:after="0" w:line="252" w:lineRule="auto"/>
+            </w:pPr>
+            <w:r>
+              <w:rPr>
+                <w:rFonts w:ascii="Arial" w:hAnsi="Arial"/>
+                <w:b w:val="0"/>
+                <w:color w:val="202A33"/>
+                <w:sz w:val="16"/>
+              </w:rPr>
+              <w:t>AWS gateway</w:t>
+            </w:r>
+          </w:p>
+        </w:tc>
+        <w:tc>
+          <w:tcPr>
+            <w:tcW w:type="dxa" w:w="1701"/>
+            <w:shd w:fill="FFFFFF"/>
+            <w:tcMar>
+              <w:top w:w="80" w:type="dxa"/>
+              <w:start w:w="120" w:type="dxa"/>
+              <w:bottom w:w="80" w:type="dxa"/>
+              <w:end w:w="120" w:type="dxa"/>
+            </w:tcMar>
+            <w:vAlign w:val="center"/>
+          </w:tcPr>
+          <w:p>
+            <w:pPr>
+              <w:spacing w:after="0" w:line="252" w:lineRule="auto"/>
+            </w:pPr>
+            <w:r>
+              <w:rPr>
+                <w:rFonts w:ascii="Arial" w:hAnsi="Arial"/>
+                <w:b w:val="0"/>
+                <w:color w:val="202A33"/>
+                <w:sz w:val="16"/>
+              </w:rPr>
+              <w:t>Passed</w:t>
+            </w:r>
+          </w:p>
+        </w:tc>
+        <w:tc>
+          <w:tcPr>
+            <w:tcW w:type="dxa" w:w="6633"/>
+            <w:shd w:fill="FFFFFF"/>
+            <w:tcMar>
+              <w:top w:w="80" w:type="dxa"/>
+              <w:start w:w="120" w:type="dxa"/>
+              <w:bottom w:w="80" w:type="dxa"/>
+              <w:end w:w="120" w:type="dxa"/>
+            </w:tcMar>
+            <w:vAlign w:val="center"/>
+          </w:tcPr>
+          <w:p>
+            <w:pPr>
+              <w:spacing w:after="0" w:line="252" w:lineRule="auto"/>
+            </w:pPr>
+            <w:r>
+              <w:rPr>
+                <w:rFonts w:ascii="Arial" w:hAnsi="Arial"/>
+                <w:b w:val="0"/>
+                <w:color w:val="202A33"/>
+                <w:sz w:val="16"/>
+              </w:rPr>
+              <w:t>http://13.207.55.75:8081/health returned UP after deploying commit 6b34fed.</w:t>
+            </w:r>
+          </w:p>
+        </w:tc>
+      </w:tr>
+      <w:tr>
+        <w:trPr>
+          <w:cantSplit/>
+        </w:trPr>
+        <w:tc>
+          <w:tcPr>
+            <w:tcW w:type="dxa" w:w="2268"/>
+            <w:shd w:fill="F4F8FA"/>
+            <w:tcMar>
+              <w:top w:w="80" w:type="dxa"/>
+              <w:start w:w="120" w:type="dxa"/>
+              <w:bottom w:w="80" w:type="dxa"/>
+              <w:end w:w="120" w:type="dxa"/>
+            </w:tcMar>
+            <w:vAlign w:val="center"/>
+          </w:tcPr>
+          <w:p>
+            <w:pPr>
+              <w:spacing w:after="0" w:line="252" w:lineRule="auto"/>
+            </w:pPr>
+            <w:r>
+              <w:rPr>
+                <w:rFonts w:ascii="Arial" w:hAnsi="Arial"/>
+                <w:b w:val="0"/>
+                <w:color w:val="202A33"/>
+                <w:sz w:val="16"/>
+              </w:rPr>
+              <w:t>Prometheus</w:t>
+            </w:r>
+          </w:p>
+        </w:tc>
+        <w:tc>
+          <w:tcPr>
+            <w:tcW w:type="dxa" w:w="1701"/>
+            <w:shd w:fill="F4F8FA"/>
+            <w:tcMar>
+              <w:top w:w="80" w:type="dxa"/>
+              <w:start w:w="120" w:type="dxa"/>
+              <w:bottom w:w="80" w:type="dxa"/>
+              <w:end w:w="120" w:type="dxa"/>
+            </w:tcMar>
+            <w:vAlign w:val="center"/>
+          </w:tcPr>
+          <w:p>
+            <w:pPr>
+              <w:spacing w:after="0" w:line="252" w:lineRule="auto"/>
+            </w:pPr>
+            <w:r>
+              <w:rPr>
+                <w:rFonts w:ascii="Arial" w:hAnsi="Arial"/>
+                <w:b w:val="0"/>
+                <w:color w:val="202A33"/>
+                <w:sz w:val="16"/>
+              </w:rPr>
+              <w:t>Passed</w:t>
+            </w:r>
+          </w:p>
+        </w:tc>
+        <w:tc>
+          <w:tcPr>
+            <w:tcW w:type="dxa" w:w="6633"/>
+            <w:shd w:fill="F4F8FA"/>
+            <w:tcMar>
+              <w:top w:w="80" w:type="dxa"/>
+              <w:start w:w="120" w:type="dxa"/>
+              <w:bottom w:w="80" w:type="dxa"/>
+              <w:end w:w="120" w:type="dxa"/>
+            </w:tcMar>
+            <w:vAlign w:val="center"/>
+          </w:tcPr>
+          <w:p>
+            <w:pPr>
+              <w:spacing w:after="0" w:line="252" w:lineRule="auto"/>
+            </w:pPr>
+            <w:r>
+              <w:rPr>
+                <w:rFonts w:ascii="Arial" w:hAnsi="Arial"/>
+                <w:b w:val="0"/>
+                <w:color w:val="202A33"/>
+                <w:sz w:val="16"/>
+              </w:rPr>
+              <w:t>The EC2 target cypher-backend was UP and returned cypher_incidents_open=6 through the Prometheus query API.</w:t>
+            </w:r>
+          </w:p>
+        </w:tc>
+      </w:tr>
+      <w:tr>
+        <w:trPr>
+          <w:cantSplit/>
+        </w:trPr>
+        <w:tc>
+          <w:tcPr>
+            <w:tcW w:type="dxa" w:w="2268"/>
+            <w:shd w:fill="FFFFFF"/>
+            <w:tcMar>
+              <w:top w:w="80" w:type="dxa"/>
+              <w:start w:w="120" w:type="dxa"/>
+              <w:bottom w:w="80" w:type="dxa"/>
+              <w:end w:w="120" w:type="dxa"/>
+            </w:tcMar>
+            <w:vAlign w:val="center"/>
+          </w:tcPr>
+          <w:p>
+            <w:pPr>
+              <w:spacing w:after="0" w:line="252" w:lineRule="auto"/>
+            </w:pPr>
+            <w:r>
+              <w:rPr>
+                <w:rFonts w:ascii="Arial" w:hAnsi="Arial"/>
+                <w:b w:val="0"/>
+                <w:color w:val="202A33"/>
+                <w:sz w:val="16"/>
+              </w:rPr>
+              <w:t>Grafana</w:t>
+            </w:r>
+          </w:p>
+        </w:tc>
+        <w:tc>
+          <w:tcPr>
+            <w:tcW w:type="dxa" w:w="1701"/>
+            <w:shd w:fill="FFFFFF"/>
+            <w:tcMar>
+              <w:top w:w="80" w:type="dxa"/>
+              <w:start w:w="120" w:type="dxa"/>
+              <w:bottom w:w="80" w:type="dxa"/>
+              <w:end w:w="120" w:type="dxa"/>
+            </w:tcMar>
+            <w:vAlign w:val="center"/>
+          </w:tcPr>
+          <w:p>
+            <w:pPr>
+              <w:spacing w:after="0" w:line="252" w:lineRule="auto"/>
+            </w:pPr>
+            <w:r>
+              <w:rPr>
+                <w:rFonts w:ascii="Arial" w:hAnsi="Arial"/>
+                <w:b w:val="0"/>
+                <w:color w:val="202A33"/>
+                <w:sz w:val="16"/>
+              </w:rPr>
+              <w:t>Passed</w:t>
+            </w:r>
+          </w:p>
+        </w:tc>
+        <w:tc>
+          <w:tcPr>
+            <w:tcW w:type="dxa" w:w="6633"/>
+            <w:shd w:fill="FFFFFF"/>
+            <w:tcMar>
+              <w:top w:w="80" w:type="dxa"/>
+              <w:start w:w="120" w:type="dxa"/>
+              <w:bottom w:w="80" w:type="dxa"/>
+              <w:end w:w="120" w:type="dxa"/>
+            </w:tcMar>
+            <w:vAlign w:val="center"/>
+          </w:tcPr>
+          <w:p>
+            <w:pPr>
+              <w:spacing w:after="0" w:line="252" w:lineRule="auto"/>
+            </w:pPr>
+            <w:r>
+              <w:rPr>
+                <w:rFonts w:ascii="Arial" w:hAnsi="Arial"/>
+                <w:b w:val="0"/>
+                <w:color w:val="202A33"/>
+                <w:sz w:val="16"/>
+              </w:rPr>
+              <w:t>CYPHER Operations Overview rendered on EC2 with live values for open incidents, JVM heap, request rate and server errors.</w:t>
+            </w:r>
+          </w:p>
+        </w:tc>
+      </w:tr>
+      <w:tr>
+        <w:trPr>
+          <w:cantSplit/>
+        </w:trPr>
+        <w:tc>
+          <w:tcPr>
+            <w:tcW w:type="dxa" w:w="2268"/>
+            <w:shd w:fill="F4F8FA"/>
+            <w:tcMar>
+              <w:top w:w="80" w:type="dxa"/>
+              <w:start w:w="120" w:type="dxa"/>
+              <w:bottom w:w="80" w:type="dxa"/>
+              <w:end w:w="120" w:type="dxa"/>
+            </w:tcMar>
+            <w:vAlign w:val="center"/>
+          </w:tcPr>
+          <w:p>
+            <w:pPr>
+              <w:spacing w:after="0" w:line="252" w:lineRule="auto"/>
+            </w:pPr>
+            <w:r>
+              <w:rPr>
+                <w:rFonts w:ascii="Arial" w:hAnsi="Arial"/>
+                <w:b w:val="0"/>
+                <w:color w:val="202A33"/>
+                <w:sz w:val="16"/>
+              </w:rPr>
+              <w:t>Jenkins</w:t>
+            </w:r>
+          </w:p>
+        </w:tc>
+        <w:tc>
+          <w:tcPr>
+            <w:tcW w:type="dxa" w:w="1701"/>
+            <w:shd w:fill="F4F8FA"/>
+            <w:tcMar>
+              <w:top w:w="80" w:type="dxa"/>
+              <w:start w:w="120" w:type="dxa"/>
+              <w:bottom w:w="80" w:type="dxa"/>
+              <w:end w:w="120" w:type="dxa"/>
+            </w:tcMar>
+            <w:vAlign w:val="center"/>
+          </w:tcPr>
+          <w:p>
+            <w:pPr>
+              <w:spacing w:after="0" w:line="252" w:lineRule="auto"/>
+            </w:pPr>
+            <w:r>
+              <w:rPr>
+                <w:rFonts w:ascii="Arial" w:hAnsi="Arial"/>
+                <w:b w:val="0"/>
+                <w:color w:val="202A33"/>
+                <w:sz w:val="16"/>
+              </w:rPr>
+              <w:t>Passed</w:t>
+            </w:r>
+          </w:p>
+        </w:tc>
+        <w:tc>
+          <w:tcPr>
+            <w:tcW w:type="dxa" w:w="6633"/>
+            <w:shd w:fill="F4F8FA"/>
+            <w:tcMar>
+              <w:top w:w="80" w:type="dxa"/>
+              <w:start w:w="120" w:type="dxa"/>
+              <w:bottom w:w="80" w:type="dxa"/>
+              <w:end w:w="120" w:type="dxa"/>
+            </w:tcMar>
+            <w:vAlign w:val="center"/>
+          </w:tcPr>
+          <w:p>
+            <w:pPr>
+              <w:spacing w:after="0" w:line="252" w:lineRule="auto"/>
+            </w:pPr>
+            <w:r>
+              <w:rPr>
+                <w:rFonts w:ascii="Arial" w:hAnsi="Arial"/>
+                <w:b w:val="0"/>
+                <w:color w:val="202A33"/>
+                <w:sz w:val="16"/>
+              </w:rPr>
+              <w:t>Build #2 of cypher-ci completed SUCCESS with 6 backend tests, the .NET 10 reporting build and Python, frontend, JSON checks.</w:t>
+            </w:r>
+          </w:p>
+        </w:tc>
+      </w:tr>
+      <w:tr>
+        <w:trPr>
+          <w:cantSplit/>
+        </w:trPr>
+        <w:tc>
+          <w:tcPr>
+            <w:tcW w:type="dxa" w:w="2268"/>
+            <w:shd w:fill="FFFFFF"/>
+            <w:tcMar>
+              <w:top w:w="80" w:type="dxa"/>
+              <w:start w:w="120" w:type="dxa"/>
+              <w:bottom w:w="80" w:type="dxa"/>
+              <w:end w:w="120" w:type="dxa"/>
+            </w:tcMar>
+            <w:vAlign w:val="center"/>
+          </w:tcPr>
+          <w:p>
+            <w:pPr>
+              <w:spacing w:after="0" w:line="252" w:lineRule="auto"/>
+            </w:pPr>
+            <w:r>
+              <w:rPr>
+                <w:rFonts w:ascii="Arial" w:hAnsi="Arial"/>
+                <w:b w:val="0"/>
+                <w:color w:val="202A33"/>
+                <w:sz w:val="16"/>
+              </w:rPr>
+              <w:t>S3 media</w:t>
+            </w:r>
+          </w:p>
+        </w:tc>
+        <w:tc>
+          <w:tcPr>
+            <w:tcW w:type="dxa" w:w="1701"/>
+            <w:shd w:fill="FFFFFF"/>
+            <w:tcMar>
+              <w:top w:w="80" w:type="dxa"/>
+              <w:start w:w="120" w:type="dxa"/>
+              <w:bottom w:w="80" w:type="dxa"/>
+              <w:end w:w="120" w:type="dxa"/>
+            </w:tcMar>
+            <w:vAlign w:val="center"/>
+          </w:tcPr>
+          <w:p>
+            <w:pPr>
+              <w:spacing w:after="0" w:line="252" w:lineRule="auto"/>
+            </w:pPr>
+            <w:r>
+              <w:rPr>
+                <w:rFonts w:ascii="Arial" w:hAnsi="Arial"/>
+                <w:b w:val="0"/>
+                <w:color w:val="202A33"/>
+                <w:sz w:val="16"/>
+              </w:rPr>
+              <w:t>Passed (S3 protocol)</w:t>
+            </w:r>
+          </w:p>
+        </w:tc>
+        <w:tc>
+          <w:tcPr>
+            <w:tcW w:type="dxa" w:w="6633"/>
+            <w:shd w:fill="FFFFFF"/>
+            <w:tcMar>
+              <w:top w:w="80" w:type="dxa"/>
+              <w:start w:w="120" w:type="dxa"/>
+              <w:bottom w:w="80" w:type="dxa"/>
+              <w:end w:w="120" w:type="dxa"/>
+            </w:tcMar>
+            <w:vAlign w:val="center"/>
+          </w:tcPr>
+          <w:p>
+            <w:pPr>
+              <w:spacing w:after="0" w:line="252" w:lineRule="auto"/>
+            </w:pPr>
+            <w:r>
+              <w:rPr>
+                <w:rFonts w:ascii="Arial" w:hAnsi="Arial"/>
+                <w:b w:val="0"/>
+                <w:color w:val="202A33"/>
+                <w:sz w:val="16"/>
+              </w:rPr>
+              <w:t>Upload, metadata listing, ten-minute signed download and delete passed; source and downloaded SHA-256 hashes matched and the stored object was removed.</w:t>
+            </w:r>
+          </w:p>
+        </w:tc>
+      </w:tr>
+    </w:tbl>
+    <w:p>
+      <w:pPr>
+        <w:spacing w:after="40"/>
+      </w:pPr>
+    </w:p>
+    <w:p>
+      <w:pPr>
+        <w:pStyle w:val="Heading2"/>
+        <w:keepNext/>
+        <w:spacing w:before="200" w:after="80"/>
+      </w:pPr>
+      <w:r>
+        <w:rPr>
+          <w:rFonts w:ascii="Arial" w:hAnsi="Arial"/>
+          <w:b/>
+          <w:color w:val="000000"/>
+          <w:sz w:val="23"/>
+        </w:rPr>
+        <w:t>AWS S3 verification boundary</w:t>
+      </w:r>
+    </w:p>
+    <w:p>
+      <w:pPr>
+        <w:spacing w:after="120" w:before="0" w:line="269" w:lineRule="auto"/>
+      </w:pPr>
+      <w:r>
+        <w:rPr>
+          <w:rFonts w:ascii="Arial" w:hAnsi="Arial"/>
+          <w:b w:val="0"/>
+          <w:color w:val="202A33"/>
+          <w:sz w:val="21"/>
+        </w:rPr>
+        <w:t>The EC2 runtime role used for this review could not call s3:CreateBucket, s3:HeadBucket, s3:ListAllMyBuckets or s3:PutObject. The application integration and its failure behaviour are complete, and the full S3 protocol round-trip passed on an independent server. The final live AWS bucket proof requires an administrator to run infra/aws/bootstrap-s3.sh or attach bucket/prefix permissions. This report does not disguise that infrastructure permission boundary as an application defect.</w:t>
+      </w:r>
+    </w:p>
+    <w:p>
+      <w:pPr>
+        <w:spacing w:after="120" w:before="0" w:line="269" w:lineRule="auto"/>
+      </w:pPr>
+      <w:r>
+        <w:rPr>
+          <w:rFonts w:ascii="Arial" w:hAnsi="Arial"/>
+          <w:b w:val="0"/>
+          <w:color w:val="202A33"/>
+          <w:sz w:val="21"/>
+        </w:rPr>
+        <w:t>After provisioning, verify upload with POST /api/incidents/{id}/media, open the returned downloadUrl before its ten-minute expiry, and complete DELETE /api/incidents/{id}/media/{mediaId}. Only then should the AWS S3 row be described as end-to-end demonstrated.</w:t>
+      </w:r>
+    </w:p>
+    <w:p>
+      <w:pPr>
+        <w:pStyle w:val="Heading1"/>
+        <w:keepNext/>
+        <w:spacing w:before="280" w:after="120"/>
+      </w:pPr>
+      <w:r>
+        <w:rPr>
+          <w:rFonts w:ascii="Arial" w:hAnsi="Arial"/>
+          <w:b/>
+          <w:color w:val="000000"/>
+          <w:sz w:val="30"/>
+        </w:rPr>
+        <w:t>9. Evidence locations</w:t>
       </w:r>
     </w:p>
     <w:p>
@@ -9190,6 +10320,34 @@
           <w:sz w:val="21"/>
         </w:rPr>
         <w:t>The complete model card is ai/evidence/README.md, with machine-readable values in ai/evidence/metrics.json and metrics.md. The manual upload examples are stored in ai/evidence/demo/ and mirrored on the Desktop under CYPHER-ML-Demo.</w:t>
+      </w:r>
+    </w:p>
+    <w:p>
+      <w:pPr>
+        <w:spacing w:after="120" w:before="0" w:line="269" w:lineRule="auto"/>
+      </w:pPr>
+      <w:r>
+        <w:rPr>
+          <w:rFonts w:ascii="Arial" w:hAnsi="Arial"/>
+          <w:b w:val="0"/>
+          <w:color w:val="202A33"/>
+          <w:sz w:val="21"/>
+        </w:rPr>
+        <w:t>Operational evidence is defined in docs/OPERATIONS.md. CI is in .github/workflows/ci.yml and Jenkinsfile; monitoring provisioning is under monitoring/; S3 and DA2 deployment helpers are under infra/aws/.</w:t>
+      </w:r>
+    </w:p>
+    <w:p>
+      <w:pPr>
+        <w:spacing w:after="120" w:before="0" w:line="269" w:lineRule="auto"/>
+      </w:pPr>
+      <w:r>
+        <w:rPr>
+          <w:rFonts w:ascii="Arial" w:hAnsi="Arial"/>
+          <w:b w:val="0"/>
+          <w:color w:val="202A33"/>
+          <w:sz w:val="21"/>
+        </w:rPr>
+        <w:t>Recorded verification notes are docs/evidence/ci-results.md for GitHub Actions and Jenkins, and docs/evidence/s3-roundtrip.md for the upload, signed download and delete checks.</w:t>
       </w:r>
     </w:p>
     <w:p>

</xml_diff>